<commit_message>
code: init basic CFG_2_SAT algorithm
</commit_message>
<xml_diff>
--- a/pres/pres_text.docx
+++ b/pres/pres_text.docx
@@ -3,97 +3,41 @@
 <w:document xmlns:wpc="http://schemas.microsoft.com/office/word/2010/wordprocessingCanvas" xmlns:cx="http://schemas.microsoft.com/office/drawing/2014/chartex" xmlns:cx1="http://schemas.microsoft.com/office/drawing/2015/9/8/chartex" xmlns:cx2="http://schemas.microsoft.com/office/drawing/2015/10/21/chartex" xmlns:cx3="http://schemas.microsoft.com/office/drawing/2016/5/9/chartex" xmlns:cx4="http://schemas.microsoft.com/office/drawing/2016/5/10/chartex" xmlns:cx5="http://schemas.microsoft.com/office/drawing/2016/5/11/chartex" xmlns:cx6="http://schemas.microsoft.com/office/drawing/2016/5/12/chartex" xmlns:cx7="http://schemas.microsoft.com/office/drawing/2016/5/13/chartex" xmlns:cx8="http://schemas.microsoft.com/office/drawing/2016/5/14/chartex" xmlns:mc="http://schemas.openxmlformats.org/markup-compatibility/2006" xmlns:aink="http://schemas.microsoft.com/office/drawing/2016/ink" xmlns:am3d="http://schemas.microsoft.com/office/drawing/2017/model3d" xmlns:o="urn:schemas-microsoft-com:office:office" xmlns:oel="http://schemas.microsoft.com/office/2019/extlst" xmlns:r="http://schemas.openxmlformats.org/officeDocument/2006/relationships" xmlns:m="http://schemas.openxmlformats.org/officeDocument/2006/math" xmlns:v="urn:schemas-microsoft-com:vml" xmlns:wp14="http://schemas.microsoft.com/office/word/2010/wordprocessingDrawing" xmlns:wp="http://schemas.openxmlformats.org/drawingml/2006/wordprocessingDrawing" xmlns:w10="urn:schemas-microsoft-com:office:word" xmlns:w="http://schemas.openxmlformats.org/wordprocessingml/2006/main" xmlns:w14="http://schemas.microsoft.com/office/word/2010/wordml" xmlns:w15="http://schemas.microsoft.com/office/word/2012/wordml" xmlns:w16cex="http://schemas.microsoft.com/office/word/2018/wordml/cex" xmlns:w16cid="http://schemas.microsoft.com/office/word/2016/wordml/cid" xmlns:w16="http://schemas.microsoft.com/office/word/2018/wordml" xmlns:w16du="http://schemas.microsoft.com/office/word/2023/wordml/word16du" xmlns:w16sdtdh="http://schemas.microsoft.com/office/word/2020/wordml/sdtdatahash" xmlns:w16sdtfl="http://schemas.microsoft.com/office/word/2024/wordml/sdtformatlock" xmlns:w16se="http://schemas.microsoft.com/office/word/2015/wordml/symex" xmlns:wpg="http://schemas.microsoft.com/office/word/2010/wordprocessingGroup" xmlns:wpi="http://schemas.microsoft.com/office/word/2010/wordprocessingInk" xmlns:wne="http://schemas.microsoft.com/office/word/2006/wordml" xmlns:wps="http://schemas.microsoft.com/office/word/2010/wordprocessingShape" mc:Ignorable="w14 w15 w16se w16cid w16 w16cex w16sdtdh w16sdtfl w16du wp14">
   <w:body>
     <w:p>
-      <w:pPr>
-        <w:rPr>
-          <w:b/>
-          <w:bCs/>
-        </w:rPr>
-      </w:pPr>
-      <w:r>
-        <w:rPr>
-          <w:b/>
-          <w:bCs/>
-        </w:rPr>
-        <w:t>Slide 1 – Základné údaje / Úvod</w:t>
-      </w:r>
-    </w:p>
-    <w:p>
-      <w:r>
-        <w:rPr>
-          <w:b/>
-          <w:bCs/>
-        </w:rPr>
-        <w:t>Diplomová práca</w:t>
+      <w:r>
+        <w:rPr>
+          <w:b/>
+          <w:bCs/>
+        </w:rPr>
+        <w:t>Slide</w:t>
+      </w:r>
+      <w:r>
+        <w:rPr>
+          <w:b/>
+          <w:bCs/>
+        </w:rPr>
+        <w:t xml:space="preserve"> </w:t>
+      </w:r>
+      <w:r>
+        <w:rPr>
+          <w:b/>
+          <w:bCs/>
+        </w:rPr>
+        <w:t xml:space="preserve"> – Základné údaje / Úvod</w:t>
+      </w:r>
+    </w:p>
+    <w:p>
+      <w:r>
+        <w:t>„Dobrý deň,</w:t>
       </w:r>
       <w:r>
         <w:br/>
-      </w:r>
-      <w:r>
-        <w:rPr>
-          <w:b/>
-          <w:bCs/>
-        </w:rPr>
-        <w:t>Názov:</w:t>
-      </w:r>
-      <w:r>
-        <w:br/>
-        <w:t>Redukcia parsovacieho problému pre bezkontextové gramatiky na SAT problém</w:t>
-      </w:r>
-    </w:p>
-    <w:p>
-      <w:r>
-        <w:rPr>
-          <w:b/>
-          <w:bCs/>
-        </w:rPr>
-        <w:t>Študent:</w:t>
-      </w:r>
-      <w:r>
-        <w:t xml:space="preserve"> </w:t>
-      </w:r>
-      <w:r>
-        <w:t xml:space="preserve">Bc. </w:t>
-      </w:r>
-      <w:r>
-        <w:t>Jozef</w:t>
+        <w:t>volám sa Jozef</w:t>
       </w:r>
       <w:r>
         <w:t xml:space="preserve"> Nyitrai</w:t>
       </w:r>
       <w:r>
-        <w:br/>
-      </w:r>
-      <w:r>
-        <w:rPr>
-          <w:b/>
-          <w:bCs/>
-        </w:rPr>
-        <w:t>Vedúci práce:</w:t>
-      </w:r>
-      <w:r>
-        <w:t xml:space="preserve"> Ing. Viliam Hromada, PhD.</w:t>
-      </w:r>
-      <w:r>
-        <w:br/>
-      </w:r>
-      <w:r>
-        <w:rPr>
-          <w:b/>
-          <w:bCs/>
-        </w:rPr>
-        <w:t>Fakulta:</w:t>
-      </w:r>
-      <w:r>
-        <w:t xml:space="preserve"> Fakulta elektrotechniky a informatiky, STU FEI</w:t>
-      </w:r>
-    </w:p>
-    <w:p>
-      <w:r>
-        <w:t>„Dobrý deň,</w:t>
-      </w:r>
-      <w:r>
-        <w:br/>
-        <w:t>volám sa Jozef a v tejto prezentácii by som chcel stručne predstaviť stav mojej diplomovej práce.</w:t>
+        <w:t xml:space="preserve"> a v tejto prezentácii by som chcel stručne predstaviť stav mojej diplomovej práce.</w:t>
       </w:r>
     </w:p>
     <w:p>
@@ -105,7 +49,39 @@
           <w:i/>
           <w:iCs/>
         </w:rPr>
-        <w:t>Redukcia parsovacieho problému pre bezkontextové gramatiky na SAT problém</w:t>
+        <w:t xml:space="preserve">Redukcia </w:t>
+      </w:r>
+      <w:proofErr w:type="spellStart"/>
+      <w:r>
+        <w:rPr>
+          <w:i/>
+          <w:iCs/>
+        </w:rPr>
+        <w:t>parsovacieho</w:t>
+      </w:r>
+      <w:proofErr w:type="spellEnd"/>
+      <w:r>
+        <w:rPr>
+          <w:i/>
+          <w:iCs/>
+        </w:rPr>
+        <w:t xml:space="preserve"> problému pre </w:t>
+      </w:r>
+      <w:proofErr w:type="spellStart"/>
+      <w:r>
+        <w:rPr>
+          <w:i/>
+          <w:iCs/>
+        </w:rPr>
+        <w:t>bezkontextové</w:t>
+      </w:r>
+      <w:proofErr w:type="spellEnd"/>
+      <w:r>
+        <w:rPr>
+          <w:i/>
+          <w:iCs/>
+        </w:rPr>
+        <w:t xml:space="preserve"> gramatiky na SAT problém</w:t>
       </w:r>
       <w:r>
         <w:t>.</w:t>
@@ -129,80 +105,62 @@
     <w:p>
       <w:r>
         <w:pict w14:anchorId="1E0BF99A">
-          <v:rect id="_x0000_i1060" style="width:0;height:1.5pt" o:hralign="center" o:hrstd="t" o:hr="t" fillcolor="#a0a0a0" stroked="f"/>
+          <v:rect id="_x0000_i1025" style="width:0;height:1.5pt" o:hralign="center" o:hrstd="t" o:hr="t" fillcolor="#a0a0a0" stroked="f"/>
         </w:pict>
       </w:r>
     </w:p>
     <w:p>
-      <w:pPr>
-        <w:rPr>
-          <w:b/>
-          <w:bCs/>
-        </w:rPr>
-      </w:pPr>
-      <w:r>
-        <w:rPr>
-          <w:b/>
-          <w:bCs/>
-        </w:rPr>
-        <w:t>Slide 2 – Predstavenie témy</w:t>
-      </w:r>
-    </w:p>
-    <w:p>
-      <w:pPr>
-        <w:numPr>
-          <w:ilvl w:val="0"/>
-          <w:numId w:val="1"/>
-        </w:numPr>
-      </w:pPr>
-      <w:r>
-        <w:t>Bezkontextové gramatiky (CFG) a parsovanie</w:t>
-      </w:r>
-    </w:p>
-    <w:p>
-      <w:pPr>
-        <w:numPr>
-          <w:ilvl w:val="0"/>
-          <w:numId w:val="1"/>
-        </w:numPr>
-      </w:pPr>
-      <w:r>
-        <w:t>Parsovací problém a jeho výpočtová náročnosť</w:t>
-      </w:r>
-    </w:p>
-    <w:p>
-      <w:pPr>
-        <w:numPr>
-          <w:ilvl w:val="0"/>
-          <w:numId w:val="1"/>
-        </w:numPr>
-      </w:pPr>
-      <w:r>
-        <w:t xml:space="preserve">SAT problém a SAT </w:t>
-      </w:r>
-      <w:r>
-        <w:t>solvery</w:t>
-      </w:r>
-    </w:p>
-    <w:p>
-      <w:pPr>
-        <w:numPr>
-          <w:ilvl w:val="0"/>
-          <w:numId w:val="1"/>
-        </w:numPr>
-      </w:pPr>
-      <w:r>
-        <w:t>Motivácia: alternatívny prístup k parsovaniu</w:t>
-      </w:r>
-    </w:p>
-    <w:p>
-      <w:r>
-        <w:t>„V rámci diplomovej práce sa zaoberám parsovacím problémom pre bezkontextové gramatiky.</w:t>
-      </w:r>
-    </w:p>
-    <w:p>
-      <w:r>
-        <w:t>Bezkontextové gramatiky zohrávajú dôležitú úlohu najmä v oblasti formálnych jazykov,</w:t>
+      <w:r>
+        <w:rPr>
+          <w:b/>
+          <w:bCs/>
+        </w:rPr>
+        <w:t xml:space="preserve">Slide </w:t>
+      </w:r>
+      <w:r>
+        <w:rPr>
+          <w:b/>
+          <w:bCs/>
+        </w:rPr>
+        <w:t>1</w:t>
+      </w:r>
+      <w:r>
+        <w:rPr>
+          <w:b/>
+          <w:bCs/>
+        </w:rPr>
+        <w:t xml:space="preserve"> – Predstavenie témy</w:t>
+      </w:r>
+    </w:p>
+    <w:p>
+      <w:r>
+        <w:t xml:space="preserve">„V rámci diplomovej práce sa zaoberám </w:t>
+      </w:r>
+      <w:proofErr w:type="spellStart"/>
+      <w:r>
+        <w:t>parsovacím</w:t>
+      </w:r>
+      <w:proofErr w:type="spellEnd"/>
+      <w:r>
+        <w:t xml:space="preserve"> problémom pre </w:t>
+      </w:r>
+      <w:proofErr w:type="spellStart"/>
+      <w:r>
+        <w:t>bezkontextové</w:t>
+      </w:r>
+      <w:proofErr w:type="spellEnd"/>
+      <w:r>
+        <w:t xml:space="preserve"> gramatiky.</w:t>
+      </w:r>
+    </w:p>
+    <w:p>
+      <w:proofErr w:type="spellStart"/>
+      <w:r>
+        <w:t>Bezkontextové</w:t>
+      </w:r>
+      <w:proofErr w:type="spellEnd"/>
+      <w:r>
+        <w:t xml:space="preserve"> gramatiky zohrávajú dôležitú úlohu najmä v oblasti formálnych jazykov,</w:t>
       </w:r>
       <w:r>
         <w:br/>
@@ -210,8 +168,21 @@
       </w:r>
     </w:p>
     <w:p>
-      <w:r>
-        <w:t>Parsovací problém spočíva v určení, či daný reťazec patrí do jazyka generovaného bezkontextovou gramatikou,</w:t>
+      <w:proofErr w:type="spellStart"/>
+      <w:r>
+        <w:t>Parsovací</w:t>
+      </w:r>
+      <w:proofErr w:type="spellEnd"/>
+      <w:r>
+        <w:t xml:space="preserve"> problém spočíva v určení, či daný reťazec patrí do jazyka generovaného </w:t>
+      </w:r>
+      <w:proofErr w:type="spellStart"/>
+      <w:r>
+        <w:t>bezkontextovou</w:t>
+      </w:r>
+      <w:proofErr w:type="spellEnd"/>
+      <w:r>
+        <w:t xml:space="preserve"> gramatikou,</w:t>
       </w:r>
       <w:r>
         <w:t xml:space="preserve"> </w:t>
@@ -222,13 +193,29 @@
     </w:p>
     <w:p>
       <w:r>
-        <w:t>Klasické parsovacie algoritmy sú dobre preskúmané, avšak v tejto práci sa zameriavam na alternatívny prístup,</w:t>
+        <w:t xml:space="preserve">Klasické </w:t>
+      </w:r>
+      <w:proofErr w:type="spellStart"/>
+      <w:r>
+        <w:t>parsovacie</w:t>
+      </w:r>
+      <w:proofErr w:type="spellEnd"/>
+      <w:r>
+        <w:t xml:space="preserve"> algoritmy sú dobre preskúmané, avšak v tejto práci sa zameriavam na alternatívny prístup,</w:t>
       </w:r>
       <w:r>
         <w:t xml:space="preserve"> </w:t>
       </w:r>
       <w:r>
-        <w:t>a to redukciu parsovacieho problému na SAT problém.</w:t>
+        <w:t xml:space="preserve">a to redukciu </w:t>
+      </w:r>
+      <w:proofErr w:type="spellStart"/>
+      <w:r>
+        <w:t>parsovacieho</w:t>
+      </w:r>
+      <w:proofErr w:type="spellEnd"/>
+      <w:r>
+        <w:t xml:space="preserve"> problému na SAT problém.</w:t>
       </w:r>
     </w:p>
     <w:p>
@@ -239,200 +226,239 @@
         <w:t xml:space="preserve"> </w:t>
       </w:r>
       <w:r>
-        <w:t>pre ktorý dnes existujú veľmi efektívne SAT riešiče.</w:t>
+        <w:t xml:space="preserve">pre ktorý dnes existujú veľmi efektívne SAT </w:t>
+      </w:r>
+      <w:proofErr w:type="spellStart"/>
+      <w:r>
+        <w:t>riešiče</w:t>
+      </w:r>
+      <w:proofErr w:type="spellEnd"/>
+      <w:r>
+        <w:t>.</w:t>
+      </w:r>
+    </w:p>
+    <w:p>
+      <w:r>
+        <w:t xml:space="preserve">Motiváciou tejto práce je preskúmať, či je možné tieto moderné SAT </w:t>
+      </w:r>
+      <w:proofErr w:type="spellStart"/>
+      <w:r>
+        <w:t>riešiče</w:t>
+      </w:r>
+      <w:proofErr w:type="spellEnd"/>
+      <w:r>
+        <w:t xml:space="preserve"> využiť aj na riešenie </w:t>
+      </w:r>
+      <w:proofErr w:type="spellStart"/>
+      <w:r>
+        <w:t>parsovacieho</w:t>
+      </w:r>
+      <w:proofErr w:type="spellEnd"/>
+      <w:r>
+        <w:t xml:space="preserve"> problému</w:t>
+      </w:r>
+      <w:r>
+        <w:t xml:space="preserve"> </w:t>
+      </w:r>
+      <w:r>
+        <w:t xml:space="preserve">pre </w:t>
+      </w:r>
+      <w:proofErr w:type="spellStart"/>
+      <w:r>
+        <w:t>bezkontextové</w:t>
+      </w:r>
+      <w:proofErr w:type="spellEnd"/>
+      <w:r>
+        <w:t xml:space="preserve"> gramatiky prostredníctvom vhodnej redukcie.“</w:t>
+      </w:r>
+    </w:p>
+    <w:p>
+      <w:r>
+        <w:pict w14:anchorId="1A57A3D8">
+          <v:rect id="_x0000_i1026" style="width:0;height:1.5pt" o:hralign="center" o:hrstd="t" o:hr="t" fillcolor="#a0a0a0" stroked="f"/>
+        </w:pict>
+      </w:r>
+    </w:p>
+    <w:p>
+      <w:r>
+        <w:rPr>
+          <w:b/>
+          <w:bCs/>
+        </w:rPr>
+        <w:t xml:space="preserve">Slide </w:t>
+      </w:r>
+      <w:r>
+        <w:rPr>
+          <w:b/>
+          <w:bCs/>
+        </w:rPr>
+        <w:t>2</w:t>
+      </w:r>
+      <w:r>
+        <w:rPr>
+          <w:b/>
+          <w:bCs/>
+        </w:rPr>
+        <w:t xml:space="preserve"> – Ciele a úlohy práce</w:t>
+      </w:r>
+    </w:p>
+    <w:p>
+      <w:r>
+        <w:t xml:space="preserve">„Hlavným cieľom mojej diplomovej práce je preskúmať možnosť riešenia </w:t>
+      </w:r>
+      <w:proofErr w:type="spellStart"/>
+      <w:r>
+        <w:t>parsovacieho</w:t>
+      </w:r>
+      <w:proofErr w:type="spellEnd"/>
+      <w:r>
+        <w:t xml:space="preserve"> problému</w:t>
+      </w:r>
+      <w:r>
+        <w:t xml:space="preserve"> </w:t>
+      </w:r>
+      <w:r>
+        <w:t xml:space="preserve">pre </w:t>
+      </w:r>
+      <w:proofErr w:type="spellStart"/>
+      <w:r>
+        <w:t>bezkontextové</w:t>
+      </w:r>
+      <w:proofErr w:type="spellEnd"/>
+      <w:r>
+        <w:t xml:space="preserve"> gramatiky pomocou jeho redukcie na SAT problém.</w:t>
+      </w:r>
+    </w:p>
+    <w:p>
+      <w:r>
+        <w:t>V rámci práce sa zameriavam predovšetkým na analýzu už publikovaných prístupov,</w:t>
+      </w:r>
+      <w:r>
+        <w:br/>
+        <w:t xml:space="preserve">ktoré využívajú SAT </w:t>
+      </w:r>
+      <w:proofErr w:type="spellStart"/>
+      <w:r>
+        <w:t>riešiče</w:t>
+      </w:r>
+      <w:proofErr w:type="spellEnd"/>
+      <w:r>
+        <w:t xml:space="preserve"> pri spracovaní </w:t>
+      </w:r>
+      <w:proofErr w:type="spellStart"/>
+      <w:r>
+        <w:t>bezkontextových</w:t>
+      </w:r>
+      <w:proofErr w:type="spellEnd"/>
+      <w:r>
+        <w:t xml:space="preserve"> gramatík.</w:t>
+      </w:r>
+    </w:p>
+    <w:p>
+      <w:r>
+        <w:t>Na základe tejto analýzy je cieľom práce buď adaptovať existujúcu metódu redukcie</w:t>
+      </w:r>
+      <w:r>
+        <w:br/>
+      </w:r>
+      <w:proofErr w:type="spellStart"/>
+      <w:r>
+        <w:t>parsovacieho</w:t>
+      </w:r>
+      <w:proofErr w:type="spellEnd"/>
+      <w:r>
+        <w:t xml:space="preserve"> problému na SAT, alebo prípadne navrhnúť vlastný prístup.</w:t>
       </w:r>
     </w:p>
     <w:p>
       <w:r>
         <w:lastRenderedPageBreak/>
-        <w:t>Motiváciou tejto práce je preskúmať, či je možné tieto moderné SAT riešiče využiť aj na riešenie parsovacieho problému</w:t>
-      </w:r>
+        <w:t>Súčasťou práce je tiež vyhodnotenie výpočtovej zložitosti navrhnutého riešenia</w:t>
+      </w:r>
+      <w:r>
+        <w:br/>
+        <w:t xml:space="preserve">a jeho praktickej použiteľnosti pri </w:t>
+      </w:r>
+      <w:proofErr w:type="spellStart"/>
+      <w:r>
+        <w:t>parsovaní</w:t>
+      </w:r>
+      <w:proofErr w:type="spellEnd"/>
       <w:r>
         <w:t xml:space="preserve"> </w:t>
       </w:r>
-      <w:r>
-        <w:t>pre bezkontextové gramatiky prostredníctvom vhodnej redukcie.“</w:t>
-      </w:r>
-    </w:p>
-    <w:p>
-      <w:r>
-        <w:pict w14:anchorId="1A57A3D8">
-          <v:rect id="_x0000_i1062" style="width:0;height:1.5pt" o:hralign="center" o:hrstd="t" o:hr="t" fillcolor="#a0a0a0" stroked="f"/>
+      <w:proofErr w:type="spellStart"/>
+      <w:r>
+        <w:t>bezkontextových</w:t>
+      </w:r>
+      <w:proofErr w:type="spellEnd"/>
+      <w:r>
+        <w:t xml:space="preserve"> gramatík.“</w:t>
+      </w:r>
+    </w:p>
+    <w:p>
+      <w:r>
+        <w:pict w14:anchorId="48C28213">
+          <v:rect id="_x0000_i1027" style="width:0;height:1.5pt" o:hralign="center" o:hrstd="t" o:hr="t" fillcolor="#a0a0a0" stroked="f"/>
         </w:pict>
       </w:r>
     </w:p>
     <w:p>
-      <w:pPr>
-        <w:rPr>
-          <w:b/>
-          <w:bCs/>
-        </w:rPr>
-      </w:pPr>
-      <w:r>
-        <w:rPr>
-          <w:b/>
-          <w:bCs/>
-        </w:rPr>
-        <w:t>Slide 3 – Ciele a úlohy práce</w:t>
-      </w:r>
-    </w:p>
-    <w:p>
-      <w:pPr>
-        <w:numPr>
-          <w:ilvl w:val="0"/>
-          <w:numId w:val="2"/>
-        </w:numPr>
-      </w:pPr>
-      <w:r>
-        <w:t>Hlavný cieľ diplomovej práce</w:t>
-      </w:r>
-    </w:p>
-    <w:p>
-      <w:pPr>
-        <w:numPr>
-          <w:ilvl w:val="0"/>
-          <w:numId w:val="2"/>
-        </w:numPr>
-      </w:pPr>
-      <w:r>
-        <w:t>Preskúmanie existujúcich prístupov</w:t>
-      </w:r>
-    </w:p>
-    <w:p>
-      <w:pPr>
-        <w:numPr>
-          <w:ilvl w:val="0"/>
-          <w:numId w:val="2"/>
-        </w:numPr>
-      </w:pPr>
-      <w:r>
-        <w:t>Návrh alebo adaptácia metódy redukcie CFG → SAT</w:t>
-      </w:r>
-    </w:p>
-    <w:p>
-      <w:pPr>
-        <w:numPr>
-          <w:ilvl w:val="0"/>
-          <w:numId w:val="2"/>
-        </w:numPr>
-      </w:pPr>
-      <w:r>
-        <w:t>Vyhodnotenie zložitosti a použiteľnosti</w:t>
-      </w:r>
-    </w:p>
-    <w:p>
-      <w:r>
-        <w:t>„Hlavným cieľom mojej diplomovej práce je preskúmať možnosť riešenia parsovacieho problému</w:t>
+      <w:r>
+        <w:rPr>
+          <w:b/>
+          <w:bCs/>
+        </w:rPr>
+        <w:t xml:space="preserve">Slide </w:t>
+      </w:r>
+      <w:r>
+        <w:rPr>
+          <w:b/>
+          <w:bCs/>
+        </w:rPr>
+        <w:t>3</w:t>
+      </w:r>
+      <w:r>
+        <w:rPr>
+          <w:b/>
+          <w:bCs/>
+        </w:rPr>
+        <w:t xml:space="preserve"> – Doterajšie výsledky práce</w:t>
+      </w:r>
+    </w:p>
+    <w:p>
+      <w:r>
+        <w:t>„V doterajšej fáze práce som sa zameral predovšetkým na štúdium existujúcich vedeckých prác,</w:t>
       </w:r>
       <w:r>
         <w:t xml:space="preserve"> </w:t>
       </w:r>
       <w:r>
-        <w:t>pre bezkontextové gramatiky pomocou jeho redukcie na SAT problém.</w:t>
-      </w:r>
-    </w:p>
-    <w:p>
-      <w:r>
-        <w:t>V rámci práce sa zameriavam predovšetkým na analýzu už publikovaných prístupov,</w:t>
-      </w:r>
-      <w:r>
-        <w:br/>
-        <w:t>ktoré využívajú SAT riešiče pri spracovaní bezkontextových gramatík.</w:t>
-      </w:r>
-    </w:p>
-    <w:p>
-      <w:r>
-        <w:t>Na základe tejto analýzy je cieľom práce buď adaptovať existujúcu metódu redukcie</w:t>
-      </w:r>
-      <w:r>
-        <w:br/>
-        <w:t>parsovacieho problému na SAT, alebo prípadne navrhnúť vlastný prístup.</w:t>
-      </w:r>
-    </w:p>
-    <w:p>
-      <w:r>
-        <w:t>Súčasťou práce je tiež vyhodnotenie výpočtovej zložitosti navrhnutého riešenia</w:t>
-      </w:r>
-      <w:r>
-        <w:br/>
-        <w:t>a jeho praktickej použiteľnosti pri parsovaní bezkontextových gramatík.“</w:t>
-      </w:r>
-    </w:p>
-    <w:p>
-      <w:r>
-        <w:pict w14:anchorId="48C28213">
-          <v:rect id="_x0000_i1058" style="width:0;height:1.5pt" o:hralign="center" o:hrstd="t" o:hr="t" fillcolor="#a0a0a0" stroked="f"/>
-        </w:pict>
-      </w:r>
-    </w:p>
-    <w:p>
-      <w:pPr>
-        <w:rPr>
-          <w:b/>
-          <w:bCs/>
-        </w:rPr>
-      </w:pPr>
-      <w:r>
-        <w:rPr>
-          <w:b/>
-          <w:bCs/>
-        </w:rPr>
-        <w:t>Slide 4 – Doterajšie výsledky práce</w:t>
-      </w:r>
-    </w:p>
-    <w:p>
-      <w:pPr>
-        <w:numPr>
-          <w:ilvl w:val="0"/>
-          <w:numId w:val="3"/>
-        </w:numPr>
-      </w:pPr>
-      <w:r>
-        <w:t>Analýza existujúcich vedeckých prác</w:t>
-      </w:r>
-    </w:p>
-    <w:p>
-      <w:pPr>
-        <w:numPr>
-          <w:ilvl w:val="0"/>
-          <w:numId w:val="3"/>
-        </w:numPr>
-      </w:pPr>
-      <w:r>
-        <w:t>Štúdium SAT-based prístupov k parsovaniu CFG</w:t>
-      </w:r>
-    </w:p>
-    <w:p>
-      <w:pPr>
-        <w:numPr>
-          <w:ilvl w:val="0"/>
-          <w:numId w:val="3"/>
-        </w:numPr>
-      </w:pPr>
-      <w:r>
-        <w:t>Náčrt vlastného algoritmického prístupu</w:t>
-      </w:r>
-    </w:p>
-    <w:p>
-      <w:pPr>
-        <w:numPr>
-          <w:ilvl w:val="0"/>
-          <w:numId w:val="3"/>
-        </w:numPr>
-      </w:pPr>
-      <w:r>
-        <w:t>Začiatok spracovania teoretickej časti práce</w:t>
-      </w:r>
-    </w:p>
-    <w:p>
-      <w:r>
-        <w:t>„V doterajšej fáze práce som sa zameral predovšetkým na štúdium existujúcich vedeckých prác,</w:t>
-      </w:r>
-      <w:r>
-        <w:t xml:space="preserve"> </w:t>
-      </w:r>
-      <w:r>
-        <w:t>ktoré sa venujú riešeniu parsovacieho problému pre bezkontextové gramatiky pomocou SAT riešičov.</w:t>
+        <w:t xml:space="preserve">ktoré sa venujú riešeniu </w:t>
+      </w:r>
+      <w:proofErr w:type="spellStart"/>
+      <w:r>
+        <w:t>parsovacieho</w:t>
+      </w:r>
+      <w:proofErr w:type="spellEnd"/>
+      <w:r>
+        <w:t xml:space="preserve"> problému pre </w:t>
+      </w:r>
+      <w:proofErr w:type="spellStart"/>
+      <w:r>
+        <w:t>bezkontextové</w:t>
+      </w:r>
+      <w:proofErr w:type="spellEnd"/>
+      <w:r>
+        <w:t xml:space="preserve"> gramatiky pomocou SAT </w:t>
+      </w:r>
+      <w:proofErr w:type="spellStart"/>
+      <w:r>
+        <w:t>riešičov</w:t>
+      </w:r>
+      <w:proofErr w:type="spellEnd"/>
+      <w:r>
+        <w:t>.</w:t>
       </w:r>
     </w:p>
     <w:p>
@@ -443,58 +469,321 @@
         <w:br/>
         <w:t xml:space="preserve">Prvou je práca </w:t>
       </w:r>
+      <w:proofErr w:type="spellStart"/>
       <w:r>
         <w:rPr>
           <w:i/>
           <w:iCs/>
         </w:rPr>
-        <w:t>Analyzing Context-Free Grammars Using an Incremental SAT Solver</w:t>
-      </w:r>
-      <w:r>
-        <w:br/>
-        <w:t>od autorov Rolanda Axelssona, Keija Heljanka a Martina Langeho,</w:t>
-      </w:r>
-      <w:r>
-        <w:t xml:space="preserve"> </w:t>
-      </w:r>
-      <w:r>
-        <w:t xml:space="preserve">ktorá sa zameriava na využitie inkrementálneho SAT </w:t>
-      </w:r>
-      <w:r>
-        <w:t>solvera</w:t>
-      </w:r>
-      <w:r>
-        <w:t xml:space="preserve"> pri analýze bezkontextových gramatík.</w:t>
-      </w:r>
-    </w:p>
-    <w:p>
-      <w:r>
-        <w:lastRenderedPageBreak/>
-        <w:t xml:space="preserve">Druhou študovanou prácou je článok </w:t>
-      </w:r>
+        <w:t>Analyzing</w:t>
+      </w:r>
+      <w:proofErr w:type="spellEnd"/>
       <w:r>
         <w:rPr>
           <w:i/>
           <w:iCs/>
         </w:rPr>
-        <w:t>Learning Context Free Grammars by Using SAT Solvers</w:t>
-      </w:r>
+        <w:t xml:space="preserve"> </w:t>
+      </w:r>
+      <w:proofErr w:type="spellStart"/>
       <w:r>
         <w:rPr>
           <w:i/>
           <w:iCs/>
         </w:rPr>
+        <w:t>Context-Free</w:t>
+      </w:r>
+      <w:proofErr w:type="spellEnd"/>
+      <w:r>
+        <w:rPr>
+          <w:i/>
+          <w:iCs/>
+        </w:rPr>
         <w:t xml:space="preserve"> </w:t>
       </w:r>
-      <w:r>
-        <w:t xml:space="preserve">od Keitu Imadu a Katsuhika Nakamuru, ktorý sa zaoberá využitím SAT </w:t>
-      </w:r>
+      <w:proofErr w:type="spellStart"/>
+      <w:r>
+        <w:rPr>
+          <w:i/>
+          <w:iCs/>
+        </w:rPr>
+        <w:t>Grammars</w:t>
+      </w:r>
+      <w:proofErr w:type="spellEnd"/>
+      <w:r>
+        <w:rPr>
+          <w:i/>
+          <w:iCs/>
+        </w:rPr>
+        <w:t xml:space="preserve"> </w:t>
+      </w:r>
+      <w:proofErr w:type="spellStart"/>
+      <w:r>
+        <w:rPr>
+          <w:i/>
+          <w:iCs/>
+        </w:rPr>
+        <w:t>Using</w:t>
+      </w:r>
+      <w:proofErr w:type="spellEnd"/>
+      <w:r>
+        <w:rPr>
+          <w:i/>
+          <w:iCs/>
+        </w:rPr>
+        <w:t xml:space="preserve"> </w:t>
+      </w:r>
+      <w:proofErr w:type="spellStart"/>
+      <w:r>
+        <w:rPr>
+          <w:i/>
+          <w:iCs/>
+        </w:rPr>
+        <w:t>an</w:t>
+      </w:r>
+      <w:proofErr w:type="spellEnd"/>
+      <w:r>
+        <w:rPr>
+          <w:i/>
+          <w:iCs/>
+        </w:rPr>
+        <w:t xml:space="preserve"> </w:t>
+      </w:r>
+      <w:proofErr w:type="spellStart"/>
+      <w:r>
+        <w:rPr>
+          <w:i/>
+          <w:iCs/>
+        </w:rPr>
+        <w:t>Incremental</w:t>
+      </w:r>
+      <w:proofErr w:type="spellEnd"/>
+      <w:r>
+        <w:rPr>
+          <w:i/>
+          <w:iCs/>
+        </w:rPr>
+        <w:t xml:space="preserve"> SAT </w:t>
+      </w:r>
+      <w:proofErr w:type="spellStart"/>
+      <w:r>
+        <w:rPr>
+          <w:i/>
+          <w:iCs/>
+        </w:rPr>
+        <w:t>Solver</w:t>
+      </w:r>
+      <w:proofErr w:type="spellEnd"/>
+      <w:r>
+        <w:br/>
+        <w:t xml:space="preserve">od autorov Rolanda </w:t>
+      </w:r>
+      <w:proofErr w:type="spellStart"/>
+      <w:r>
+        <w:t>Axelssona</w:t>
+      </w:r>
+      <w:proofErr w:type="spellEnd"/>
+      <w:r>
+        <w:t xml:space="preserve">, </w:t>
+      </w:r>
+      <w:proofErr w:type="spellStart"/>
+      <w:r>
+        <w:t>Keija</w:t>
+      </w:r>
+      <w:proofErr w:type="spellEnd"/>
+      <w:r>
+        <w:t xml:space="preserve"> </w:t>
+      </w:r>
+      <w:proofErr w:type="spellStart"/>
+      <w:r>
+        <w:t>Heljanka</w:t>
+      </w:r>
+      <w:proofErr w:type="spellEnd"/>
+      <w:r>
+        <w:t xml:space="preserve"> a Martina </w:t>
+      </w:r>
+      <w:proofErr w:type="spellStart"/>
+      <w:r>
+        <w:t>Langeho</w:t>
+      </w:r>
+      <w:proofErr w:type="spellEnd"/>
+      <w:r>
+        <w:t>,</w:t>
+      </w:r>
+      <w:r>
+        <w:t xml:space="preserve"> </w:t>
+      </w:r>
+      <w:r>
+        <w:t xml:space="preserve">ktorá sa zameriava na využitie inkrementálneho SAT </w:t>
+      </w:r>
+      <w:proofErr w:type="spellStart"/>
+      <w:r>
+        <w:t>solvera</w:t>
+      </w:r>
+      <w:proofErr w:type="spellEnd"/>
+      <w:r>
+        <w:t xml:space="preserve"> pri analýze </w:t>
+      </w:r>
+      <w:proofErr w:type="spellStart"/>
+      <w:r>
+        <w:t>bezkontextových</w:t>
+      </w:r>
+      <w:proofErr w:type="spellEnd"/>
+      <w:r>
+        <w:t xml:space="preserve"> gramatík.</w:t>
+      </w:r>
+    </w:p>
+    <w:p>
+      <w:r>
+        <w:t xml:space="preserve">Druhou študovanou prácou je článok </w:t>
+      </w:r>
+      <w:proofErr w:type="spellStart"/>
+      <w:r>
+        <w:rPr>
+          <w:i/>
+          <w:iCs/>
+        </w:rPr>
+        <w:t>Learning</w:t>
+      </w:r>
+      <w:proofErr w:type="spellEnd"/>
+      <w:r>
+        <w:rPr>
+          <w:i/>
+          <w:iCs/>
+        </w:rPr>
+        <w:t xml:space="preserve"> </w:t>
+      </w:r>
+      <w:proofErr w:type="spellStart"/>
+      <w:r>
+        <w:rPr>
+          <w:i/>
+          <w:iCs/>
+        </w:rPr>
+        <w:t>Context</w:t>
+      </w:r>
+      <w:proofErr w:type="spellEnd"/>
+      <w:r>
+        <w:rPr>
+          <w:i/>
+          <w:iCs/>
+        </w:rPr>
+        <w:t xml:space="preserve"> </w:t>
+      </w:r>
+      <w:proofErr w:type="spellStart"/>
+      <w:r>
+        <w:rPr>
+          <w:i/>
+          <w:iCs/>
+        </w:rPr>
+        <w:t>Free</w:t>
+      </w:r>
+      <w:proofErr w:type="spellEnd"/>
+      <w:r>
+        <w:rPr>
+          <w:i/>
+          <w:iCs/>
+        </w:rPr>
+        <w:t xml:space="preserve"> </w:t>
+      </w:r>
+      <w:proofErr w:type="spellStart"/>
+      <w:r>
+        <w:rPr>
+          <w:i/>
+          <w:iCs/>
+        </w:rPr>
+        <w:t>Grammars</w:t>
+      </w:r>
+      <w:proofErr w:type="spellEnd"/>
+      <w:r>
+        <w:rPr>
+          <w:i/>
+          <w:iCs/>
+        </w:rPr>
+        <w:t xml:space="preserve"> by </w:t>
+      </w:r>
+      <w:proofErr w:type="spellStart"/>
+      <w:r>
+        <w:rPr>
+          <w:i/>
+          <w:iCs/>
+        </w:rPr>
+        <w:t>Using</w:t>
+      </w:r>
+      <w:proofErr w:type="spellEnd"/>
+      <w:r>
+        <w:rPr>
+          <w:i/>
+          <w:iCs/>
+        </w:rPr>
+        <w:t xml:space="preserve"> SAT </w:t>
+      </w:r>
+      <w:proofErr w:type="spellStart"/>
+      <w:r>
+        <w:rPr>
+          <w:i/>
+          <w:iCs/>
+        </w:rPr>
+        <w:t>Solvers</w:t>
+      </w:r>
+      <w:proofErr w:type="spellEnd"/>
+      <w:r>
+        <w:rPr>
+          <w:i/>
+          <w:iCs/>
+        </w:rPr>
+        <w:t xml:space="preserve"> </w:t>
+      </w:r>
+      <w:r>
+        <w:t xml:space="preserve">od </w:t>
+      </w:r>
+      <w:proofErr w:type="spellStart"/>
+      <w:r>
+        <w:t>Keitu</w:t>
+      </w:r>
+      <w:proofErr w:type="spellEnd"/>
+      <w:r>
+        <w:t xml:space="preserve"> </w:t>
+      </w:r>
+      <w:proofErr w:type="spellStart"/>
+      <w:r>
+        <w:t>Imadu</w:t>
+      </w:r>
+      <w:proofErr w:type="spellEnd"/>
+      <w:r>
+        <w:t xml:space="preserve"> a </w:t>
+      </w:r>
+      <w:proofErr w:type="spellStart"/>
+      <w:r>
+        <w:t>Katsuhika</w:t>
+      </w:r>
+      <w:proofErr w:type="spellEnd"/>
+      <w:r>
+        <w:t xml:space="preserve"> </w:t>
+      </w:r>
+      <w:proofErr w:type="spellStart"/>
+      <w:r>
+        <w:t>Nakamuru</w:t>
+      </w:r>
+      <w:proofErr w:type="spellEnd"/>
+      <w:r>
+        <w:t xml:space="preserve">, ktorý sa zaoberá využitím SAT </w:t>
+      </w:r>
+      <w:proofErr w:type="spellStart"/>
       <w:r>
         <w:t>solverov</w:t>
       </w:r>
+      <w:proofErr w:type="spellEnd"/>
       <w:r>
         <w:br/>
-        <w:t>pri učení bezkontextových gramatík.</w:t>
+        <w:t xml:space="preserve">pri učení </w:t>
+      </w:r>
+      <w:proofErr w:type="spellStart"/>
+      <w:r>
+        <w:t>bezkontextových</w:t>
+      </w:r>
+      <w:proofErr w:type="spellEnd"/>
+      <w:r>
+        <w:t xml:space="preserve"> gramatík.</w:t>
       </w:r>
     </w:p>
     <w:p>
@@ -505,7 +794,15 @@
         <w:t xml:space="preserve"> </w:t>
       </w:r>
       <w:r>
-        <w:t>ktorý vychádza z myšlienky redukcie parsovacieho problému na SAT problém,</w:t>
+        <w:t xml:space="preserve">ktorý vychádza z myšlienky redukcie </w:t>
+      </w:r>
+      <w:proofErr w:type="spellStart"/>
+      <w:r>
+        <w:t>parsovacieho</w:t>
+      </w:r>
+      <w:proofErr w:type="spellEnd"/>
+      <w:r>
+        <w:t xml:space="preserve"> problému na SAT problém,</w:t>
       </w:r>
       <w:r>
         <w:br/>
@@ -518,17 +815,40 @@
       </w:r>
       <w:r>
         <w:br/>
-        <w:t>ktorá sa zameriava na formálne jazyky, bezkontextové gramatiky,</w:t>
+        <w:t xml:space="preserve">ktorá sa zameriava na formálne jazyky, </w:t>
+      </w:r>
+      <w:proofErr w:type="spellStart"/>
+      <w:r>
+        <w:t>bezkontextové</w:t>
+      </w:r>
+      <w:proofErr w:type="spellEnd"/>
+      <w:r>
+        <w:t xml:space="preserve"> gramatiky,</w:t>
       </w:r>
       <w:r>
         <w:br/>
-        <w:t>parsovanie a základné princípy SAT problémov a SAT riešičov.“</w:t>
+      </w:r>
+      <w:proofErr w:type="spellStart"/>
+      <w:r>
+        <w:t>parsovanie</w:t>
+      </w:r>
+      <w:proofErr w:type="spellEnd"/>
+      <w:r>
+        <w:t xml:space="preserve"> a základné princípy SAT problémov a SAT </w:t>
+      </w:r>
+      <w:proofErr w:type="spellStart"/>
+      <w:r>
+        <w:t>riešičov</w:t>
+      </w:r>
+      <w:proofErr w:type="spellEnd"/>
+      <w:r>
+        <w:t>.“</w:t>
       </w:r>
     </w:p>
     <w:p>
       <w:r>
         <w:pict w14:anchorId="7351523A">
-          <v:rect id="_x0000_i1074" style="width:0;height:1.5pt" o:hralign="center" o:hrstd="t" o:hr="t" fillcolor="#a0a0a0" stroked="f"/>
+          <v:rect id="_x0000_i1028" style="width:0;height:1.5pt" o:hralign="center" o:hrstd="t" o:hr="t" fillcolor="#a0a0a0" stroked="f"/>
         </w:pict>
       </w:r>
     </w:p>
@@ -538,51 +858,21 @@
           <w:b/>
           <w:bCs/>
         </w:rPr>
-        <w:t>Slide 5 – Návrh vlastného algoritmu</w:t>
-      </w:r>
-    </w:p>
-    <w:p>
-      <w:pPr>
-        <w:numPr>
-          <w:ilvl w:val="0"/>
-          <w:numId w:val="7"/>
-        </w:numPr>
-      </w:pPr>
-      <w:r>
-        <w:t>Vstup: bezkontextová gramatika a vstupný reťazec</w:t>
-      </w:r>
-    </w:p>
-    <w:p>
-      <w:pPr>
-        <w:numPr>
-          <w:ilvl w:val="0"/>
-          <w:numId w:val="7"/>
-        </w:numPr>
-      </w:pPr>
-      <w:r>
-        <w:t>Reprezentácia parsovania pomocou booleovských premenných</w:t>
-      </w:r>
-    </w:p>
-    <w:p>
-      <w:pPr>
-        <w:numPr>
-          <w:ilvl w:val="0"/>
-          <w:numId w:val="7"/>
-        </w:numPr>
-      </w:pPr>
-      <w:r>
-        <w:t>Prevod syntaktických pravidiel na SAT klauzuly</w:t>
-      </w:r>
-    </w:p>
-    <w:p>
-      <w:pPr>
-        <w:numPr>
-          <w:ilvl w:val="0"/>
-          <w:numId w:val="7"/>
-        </w:numPr>
-      </w:pPr>
-      <w:r>
-        <w:t>Overenie existencie platného parsovania pomocou SAT riešiča</w:t>
+        <w:t xml:space="preserve">Slide </w:t>
+      </w:r>
+      <w:r>
+        <w:rPr>
+          <w:b/>
+          <w:bCs/>
+        </w:rPr>
+        <w:t>4</w:t>
+      </w:r>
+      <w:r>
+        <w:rPr>
+          <w:b/>
+          <w:bCs/>
+        </w:rPr>
+        <w:t xml:space="preserve"> – Návrh vlastného algoritmu</w:t>
       </w:r>
     </w:p>
     <w:p>
@@ -591,16 +881,45 @@
       </w:r>
       <w:r>
         <w:br/>
-        <w:t>k redukcii parsovacieho problému pre bezkontextové gramatiky na SAT problém.</w:t>
-      </w:r>
-    </w:p>
-    <w:p>
-      <w:r>
-        <w:t>Základnou myšlienkou algoritmu je reprezentovať proces parsovania</w:t>
-      </w:r>
+        <w:t xml:space="preserve">k redukcii </w:t>
+      </w:r>
+      <w:proofErr w:type="spellStart"/>
+      <w:r>
+        <w:t>parsovacieho</w:t>
+      </w:r>
+      <w:proofErr w:type="spellEnd"/>
+      <w:r>
+        <w:t xml:space="preserve"> problému pre </w:t>
+      </w:r>
+      <w:proofErr w:type="spellStart"/>
+      <w:r>
+        <w:t>bezkontextové</w:t>
+      </w:r>
+      <w:proofErr w:type="spellEnd"/>
+      <w:r>
+        <w:t xml:space="preserve"> gramatiky na SAT problém.</w:t>
+      </w:r>
+    </w:p>
+    <w:p>
+      <w:r>
+        <w:t xml:space="preserve">Základnou myšlienkou algoritmu je reprezentovať proces </w:t>
+      </w:r>
+      <w:proofErr w:type="spellStart"/>
+      <w:r>
+        <w:t>parsovania</w:t>
+      </w:r>
+      <w:proofErr w:type="spellEnd"/>
       <w:r>
         <w:br/>
-        <w:t>pomocou booleovských premenných, ktoré vyjadrujú vzťahy medzi neterminálmi gramatiky,</w:t>
+        <w:t xml:space="preserve">pomocou booleovských premenných, ktoré vyjadrujú vzťahy medzi </w:t>
+      </w:r>
+      <w:proofErr w:type="spellStart"/>
+      <w:r>
+        <w:t>neterminálmi</w:t>
+      </w:r>
+      <w:proofErr w:type="spellEnd"/>
+      <w:r>
+        <w:t xml:space="preserve"> gramatiky,</w:t>
       </w:r>
       <w:r>
         <w:t xml:space="preserve"> </w:t>
@@ -611,7 +930,15 @@
     </w:p>
     <w:p>
       <w:r>
-        <w:t>Produkčné pravidlá bezkontextovej gramatiky sú následne transformované</w:t>
+        <w:t xml:space="preserve">Produkčné pravidlá </w:t>
+      </w:r>
+      <w:proofErr w:type="spellStart"/>
+      <w:r>
+        <w:t>bezkontextovej</w:t>
+      </w:r>
+      <w:proofErr w:type="spellEnd"/>
+      <w:r>
+        <w:t xml:space="preserve"> gramatiky sú následne transformované</w:t>
       </w:r>
       <w:r>
         <w:br/>
@@ -621,16 +948,26 @@
         <w:t xml:space="preserve"> </w:t>
       </w:r>
       <w:r>
-        <w:t>zodpovedala existencii platného parsovania vstupného reťazca.</w:t>
+        <w:t xml:space="preserve">zodpovedala existencii platného </w:t>
+      </w:r>
+      <w:proofErr w:type="spellStart"/>
+      <w:r>
+        <w:t>parsovania</w:t>
+      </w:r>
+      <w:proofErr w:type="spellEnd"/>
+      <w:r>
+        <w:t xml:space="preserve"> vstupného reťazca.</w:t>
       </w:r>
     </w:p>
     <w:p>
       <w:r>
         <w:t xml:space="preserve">Výsledná SAT formula je potom riešená pomocou SAT </w:t>
       </w:r>
+      <w:proofErr w:type="spellStart"/>
       <w:r>
         <w:t>solvera</w:t>
       </w:r>
+      <w:proofErr w:type="spellEnd"/>
       <w:r>
         <w:t>,</w:t>
       </w:r>
@@ -644,24 +981,46 @@
         <w:t xml:space="preserve"> </w:t>
       </w:r>
       <w:r>
-        <w:t>generovaného danou bezkontextovou gramatikou.</w:t>
-      </w:r>
-    </w:p>
-    <w:p>
-      <w:r>
+        <w:t xml:space="preserve">generovaného danou </w:t>
+      </w:r>
+      <w:proofErr w:type="spellStart"/>
+      <w:r>
+        <w:t>bezkontextovou</w:t>
+      </w:r>
+      <w:proofErr w:type="spellEnd"/>
+      <w:r>
+        <w:t xml:space="preserve"> gramatikou.</w:t>
+      </w:r>
+    </w:p>
+    <w:p>
+      <w:r>
+        <w:lastRenderedPageBreak/>
         <w:t xml:space="preserve">Tento prístup umožňuje využiť silu moderných SAT </w:t>
       </w:r>
-      <w:r>
-        <w:t xml:space="preserve">solverov </w:t>
-      </w:r>
-      <w:r>
-        <w:t>ako alternatívny mechanizmus k tradičným parsovacím algoritmom.“</w:t>
+      <w:proofErr w:type="spellStart"/>
+      <w:r>
+        <w:t>solverov</w:t>
+      </w:r>
+      <w:proofErr w:type="spellEnd"/>
+      <w:r>
+        <w:t xml:space="preserve"> </w:t>
+      </w:r>
+      <w:r>
+        <w:t xml:space="preserve">ako alternatívny mechanizmus k tradičným </w:t>
+      </w:r>
+      <w:proofErr w:type="spellStart"/>
+      <w:r>
+        <w:t>parsovacím</w:t>
+      </w:r>
+      <w:proofErr w:type="spellEnd"/>
+      <w:r>
+        <w:t xml:space="preserve"> algoritmom.“</w:t>
       </w:r>
     </w:p>
     <w:p>
       <w:r>
         <w:pict w14:anchorId="24463B96">
-          <v:rect id="_x0000_i1096" style="width:0;height:1.5pt" o:hralign="center" o:hrstd="t" o:hr="t" fillcolor="#a0a0a0" stroked="f"/>
+          <v:rect id="_x0000_i1029" style="width:0;height:1.5pt" o:hralign="center" o:hrstd="t" o:hr="t" fillcolor="#a0a0a0" stroked="f"/>
         </w:pict>
       </w:r>
     </w:p>
@@ -672,12 +1031,515 @@
           <w:bCs/>
         </w:rPr>
       </w:pPr>
-      <w:r>
-        <w:rPr>
-          <w:b/>
-          <w:bCs/>
-        </w:rPr>
-        <w:t xml:space="preserve">Final </w:t>
+      <w:proofErr w:type="spellStart"/>
+      <w:r>
+        <w:rPr>
+          <w:b/>
+          <w:bCs/>
+        </w:rPr>
+        <w:t>Priklad</w:t>
+      </w:r>
+      <w:proofErr w:type="spellEnd"/>
+      <w:r>
+        <w:rPr>
+          <w:b/>
+          <w:bCs/>
+        </w:rPr>
+        <w:t xml:space="preserve"> </w:t>
+      </w:r>
+      <w:proofErr w:type="spellStart"/>
+      <w:r>
+        <w:rPr>
+          <w:b/>
+          <w:bCs/>
+        </w:rPr>
+        <w:t>slide</w:t>
+      </w:r>
+      <w:r>
+        <w:rPr>
+          <w:b/>
+          <w:bCs/>
+        </w:rPr>
+        <w:t>s</w:t>
+      </w:r>
+      <w:proofErr w:type="spellEnd"/>
+      <w:r>
+        <w:rPr>
+          <w:b/>
+          <w:bCs/>
+        </w:rPr>
+        <w:t xml:space="preserve"> 4</w:t>
+      </w:r>
+    </w:p>
+    <w:p>
+      <w:r>
+        <w:t xml:space="preserve">Vyberieme si </w:t>
+      </w:r>
+      <w:proofErr w:type="spellStart"/>
+      <w:r>
+        <w:t>bezkontextovú</w:t>
+      </w:r>
+      <w:proofErr w:type="spellEnd"/>
+      <w:r>
+        <w:t xml:space="preserve"> gramatiku v </w:t>
+      </w:r>
+      <w:proofErr w:type="spellStart"/>
+      <w:r>
+        <w:t>Chomského</w:t>
+      </w:r>
+      <w:proofErr w:type="spellEnd"/>
+      <w:r>
+        <w:t xml:space="preserve"> normálnej forme (CNF).</w:t>
+      </w:r>
+    </w:p>
+    <w:p>
+      <w:pPr>
+        <w:rPr>
+          <w:b/>
+          <w:bCs/>
+        </w:rPr>
+      </w:pPr>
+      <w:r>
+        <w:t>Táto gramatika je v CHNF, pretože každé pravidlo má buď práve dvoch neterminálnych potomkov , alebo práve jeden terminálny symbol na pravej strane. Gramatika generuje všetky reťazce dĺžky 3 nad abecedou (</w:t>
+      </w:r>
+      <w:proofErr w:type="spellStart"/>
+      <w:r>
+        <w:t>a,b</w:t>
+      </w:r>
+      <w:proofErr w:type="spellEnd"/>
+      <w:r>
+        <w:t>)</w:t>
+      </w:r>
+      <w:r>
+        <w:t xml:space="preserve">. Vstupné slovo: </w:t>
+      </w:r>
+      <w:proofErr w:type="spellStart"/>
+      <w:r>
+        <w:t>aba</w:t>
+      </w:r>
+      <w:proofErr w:type="spellEnd"/>
+      <w:r>
+        <w:t xml:space="preserve">, </w:t>
+      </w:r>
+      <w:r>
+        <w:t>patrí do jazyka</w:t>
+      </w:r>
+      <w:r>
+        <w:t>.</w:t>
+      </w:r>
+    </w:p>
+    <w:p>
+      <w:pPr>
+        <w:rPr>
+          <w:b/>
+          <w:bCs/>
+        </w:rPr>
+      </w:pPr>
+      <w:r>
+        <w:rPr>
+          <w:b/>
+          <w:bCs/>
+        </w:rPr>
+        <w:t>5</w:t>
+      </w:r>
+    </w:p>
+    <w:p>
+      <w:r>
+        <w:t>Pred samotným algoritmom zavádzame booleovské premenné tvaru X(</w:t>
+      </w:r>
+      <w:r>
+        <w:t>N</w:t>
+      </w:r>
+      <w:r>
+        <w:t>, i, j), ktoré reprezentujú tvrdenia typu: „</w:t>
+      </w:r>
+      <w:proofErr w:type="spellStart"/>
+      <w:r>
+        <w:t>neterminál</w:t>
+      </w:r>
+      <w:proofErr w:type="spellEnd"/>
+      <w:r>
+        <w:t xml:space="preserve"> </w:t>
+      </w:r>
+      <w:r>
+        <w:t>N</w:t>
+      </w:r>
+      <w:r>
+        <w:t xml:space="preserve"> môže odvodiť (vygenerovať) podreťazec vstupného slova od pozície i po pozíciu j.</w:t>
+      </w:r>
+    </w:p>
+    <w:p>
+      <w:pPr>
+        <w:rPr>
+          <w:b/>
+          <w:bCs/>
+        </w:rPr>
+      </w:pPr>
+      <w:r>
+        <w:rPr>
+          <w:b/>
+          <w:bCs/>
+        </w:rPr>
+        <w:t>6</w:t>
+      </w:r>
+    </w:p>
+    <w:p>
+      <w:r>
+        <w:t xml:space="preserve">V danom prípade máme spolu 24 takýchto booleovských premenných, keďže pracujeme so 4 </w:t>
+      </w:r>
+      <w:proofErr w:type="spellStart"/>
+      <w:r>
+        <w:t>neterminálmi</w:t>
+      </w:r>
+      <w:proofErr w:type="spellEnd"/>
+      <w:r>
+        <w:t xml:space="preserve"> a so 6 možnými kombináciami indexov i a j.</w:t>
+      </w:r>
+    </w:p>
+    <w:p>
+      <w:pPr>
+        <w:rPr>
+          <w:b/>
+          <w:bCs/>
+        </w:rPr>
+      </w:pPr>
+      <w:r>
+        <w:rPr>
+          <w:b/>
+          <w:bCs/>
+        </w:rPr>
+        <w:t>7</w:t>
+      </w:r>
+    </w:p>
+    <w:p>
+      <w:r>
+        <w:t xml:space="preserve">Terminálne pravidlá určujú, ktorý </w:t>
+      </w:r>
+      <w:proofErr w:type="spellStart"/>
+      <w:r>
+        <w:t>neterminál</w:t>
+      </w:r>
+      <w:proofErr w:type="spellEnd"/>
+      <w:r>
+        <w:t xml:space="preserve"> môže generovať konkrétny terminálny symbol.</w:t>
+      </w:r>
+      <w:r>
+        <w:br/>
+        <w:t xml:space="preserve">V gramatike v </w:t>
+      </w:r>
+      <w:proofErr w:type="spellStart"/>
+      <w:r>
+        <w:t>Chomského</w:t>
+      </w:r>
+      <w:proofErr w:type="spellEnd"/>
+      <w:r>
+        <w:t xml:space="preserve"> normálnej forme má každý terminálny symbol priradené </w:t>
+      </w:r>
+      <w:proofErr w:type="spellStart"/>
+      <w:r>
+        <w:t>neterminály</w:t>
+      </w:r>
+      <w:proofErr w:type="spellEnd"/>
+      <w:r>
+        <w:t>, ktoré ho dokážu produkovať.</w:t>
+      </w:r>
+      <w:r>
+        <w:br/>
+        <w:t>Preto najprv prechádzame všetky intervaly dĺžky 1 a na základe terminálnych pravidiel zapisujeme príslušné hodnoty do tabuľky.</w:t>
+      </w:r>
+    </w:p>
+    <w:p>
+      <w:pPr>
+        <w:rPr>
+          <w:b/>
+          <w:bCs/>
+        </w:rPr>
+      </w:pPr>
+      <w:r>
+        <w:rPr>
+          <w:b/>
+          <w:bCs/>
+        </w:rPr>
+        <w:t>8</w:t>
+      </w:r>
+    </w:p>
+    <w:p>
+      <w:r>
+        <w:t>Rovnakým spôsobom postupujeme aj pri intervaloch ⟨2, 2⟩ a ⟨3, 3⟩.</w:t>
+      </w:r>
+    </w:p>
+    <w:p>
+      <w:pPr>
+        <w:rPr>
+          <w:b/>
+          <w:bCs/>
+        </w:rPr>
+      </w:pPr>
+      <w:r>
+        <w:rPr>
+          <w:b/>
+          <w:bCs/>
+        </w:rPr>
+        <w:t>9</w:t>
+      </w:r>
+    </w:p>
+    <w:p>
+      <w:r>
+        <w:t xml:space="preserve">Neterminálne pravidlá určujú, ako môže </w:t>
+      </w:r>
+      <w:proofErr w:type="spellStart"/>
+      <w:r>
+        <w:t>neterminál</w:t>
+      </w:r>
+      <w:proofErr w:type="spellEnd"/>
+      <w:r>
+        <w:t xml:space="preserve"> pokryť väčší interval jeho rozkladom na dve časti.</w:t>
+      </w:r>
+      <w:r>
+        <w:br/>
+        <w:t xml:space="preserve">Pravidlo tvaru A → B C znamená, že </w:t>
+      </w:r>
+      <w:proofErr w:type="spellStart"/>
+      <w:r>
+        <w:t>neterminál</w:t>
+      </w:r>
+      <w:proofErr w:type="spellEnd"/>
+      <w:r>
+        <w:t xml:space="preserve"> A môže odvodiť podreťazec od pozície i po j práve vtedy, ak existuje index k medzi i a j taký, že B pokrýva ľavú časť intervalu ⟨i, k⟩ a C pokrýva pravú časť ⟨k + 1, j⟩.</w:t>
+      </w:r>
+      <w:r>
+        <w:t xml:space="preserve"> </w:t>
+      </w:r>
+    </w:p>
+    <w:p>
+      <w:r>
+        <w:t xml:space="preserve">Inými slovami, interval ⟨i, j⟩ rozdelíme na dva </w:t>
+      </w:r>
+      <w:proofErr w:type="spellStart"/>
+      <w:r>
+        <w:t>podintervaly</w:t>
+      </w:r>
+      <w:proofErr w:type="spellEnd"/>
+      <w:r>
+        <w:t xml:space="preserve"> a odvodenie A nad týmto intervalom je platné, ak B generuje prvý podreťazec a C druhý.</w:t>
+      </w:r>
+      <w:r>
+        <w:t xml:space="preserve"> </w:t>
+      </w:r>
+      <w:r>
+        <w:t>Najskôr sa zameriame na intervaly dĺžky 2 a aplikujeme na prvé neterminálne pravidlo.</w:t>
+      </w:r>
+    </w:p>
+    <w:p>
+      <w:pPr>
+        <w:rPr>
+          <w:b/>
+          <w:bCs/>
+        </w:rPr>
+      </w:pPr>
+      <w:r>
+        <w:rPr>
+          <w:b/>
+          <w:bCs/>
+        </w:rPr>
+        <w:lastRenderedPageBreak/>
+        <w:t>10</w:t>
+      </w:r>
+    </w:p>
+    <w:p>
+      <w:r>
+        <w:t>Rovnakým spôsobom postupujeme aj pri interval</w:t>
+      </w:r>
+      <w:r>
+        <w:t>y</w:t>
+      </w:r>
+      <w:r>
+        <w:t xml:space="preserve"> ⟨2, </w:t>
+      </w:r>
+      <w:r>
+        <w:t>3</w:t>
+      </w:r>
+      <w:r>
+        <w:t>⟩.</w:t>
+      </w:r>
+    </w:p>
+    <w:p>
+      <w:pPr>
+        <w:rPr>
+          <w:b/>
+          <w:bCs/>
+        </w:rPr>
+      </w:pPr>
+      <w:r>
+        <w:rPr>
+          <w:b/>
+          <w:bCs/>
+        </w:rPr>
+        <w:t>11</w:t>
+      </w:r>
+    </w:p>
+    <w:p>
+      <w:r>
+        <w:t>Pri intervale ⟨1, 3⟩ existujú dve možné hodnoty indexu k, a preto vznikajú dve možné implikácie, z ktorých následne dostaneme štyri klauzuly.</w:t>
+      </w:r>
+    </w:p>
+    <w:p>
+      <w:pPr>
+        <w:rPr>
+          <w:b/>
+          <w:bCs/>
+        </w:rPr>
+      </w:pPr>
+      <w:r>
+        <w:rPr>
+          <w:b/>
+          <w:bCs/>
+        </w:rPr>
+        <w:t>12</w:t>
+      </w:r>
+    </w:p>
+    <w:p>
+      <w:r>
+        <w:t>Rovnakým spôsobom postupujeme aj pri druhom pravidle, pričom získame osem klauzúl.</w:t>
+      </w:r>
+    </w:p>
+    <w:p>
+      <w:pPr>
+        <w:rPr>
+          <w:b/>
+          <w:bCs/>
+        </w:rPr>
+      </w:pPr>
+      <w:r>
+        <w:rPr>
+          <w:b/>
+          <w:bCs/>
+        </w:rPr>
+        <w:t>13</w:t>
+      </w:r>
+    </w:p>
+    <w:p>
+      <w:r>
+        <w:t xml:space="preserve">Naša gramatika neobsahuje žiadne neterminálne pravidlá pre </w:t>
+      </w:r>
+      <w:proofErr w:type="spellStart"/>
+      <w:r>
+        <w:t>neterminály</w:t>
+      </w:r>
+      <w:proofErr w:type="spellEnd"/>
+      <w:r>
+        <w:t xml:space="preserve"> B ani C.</w:t>
+      </w:r>
+      <w:r>
+        <w:br/>
+        <w:t xml:space="preserve">Z toho vyplýva dôležitý fakt: </w:t>
+      </w:r>
+      <w:proofErr w:type="spellStart"/>
+      <w:r>
+        <w:t>neterminály</w:t>
+      </w:r>
+      <w:proofErr w:type="spellEnd"/>
+      <w:r>
+        <w:t xml:space="preserve"> B a C nedokážu odvodiť žiadny reťazec dlhší ako jeden symbol.</w:t>
+      </w:r>
+      <w:r>
+        <w:t xml:space="preserve"> </w:t>
+      </w:r>
+      <w:r>
+        <w:t>Tieto informácie následne zapíšeme do tabuľky.</w:t>
+      </w:r>
+    </w:p>
+    <w:p>
+      <w:pPr>
+        <w:rPr>
+          <w:b/>
+          <w:bCs/>
+        </w:rPr>
+      </w:pPr>
+      <w:r>
+        <w:rPr>
+          <w:b/>
+          <w:bCs/>
+        </w:rPr>
+        <w:t>14</w:t>
+      </w:r>
+    </w:p>
+    <w:p>
+      <w:r>
+        <w:t>Napokon, aby formula vyjadrovala, že celé vstupné slovo je odvodené danou gramatikou, pridáme klauzulu, ktorá vyžaduje, aby počiatočný symbol S pokrýval celý interval ⟨1, n⟩.</w:t>
+      </w:r>
+    </w:p>
+    <w:p>
+      <w:pPr>
+        <w:rPr>
+          <w:b/>
+          <w:bCs/>
+        </w:rPr>
+      </w:pPr>
+      <w:r>
+        <w:rPr>
+          <w:b/>
+          <w:bCs/>
+        </w:rPr>
+        <w:t>15</w:t>
+      </w:r>
+    </w:p>
+    <w:p>
+      <w:r>
+        <w:t xml:space="preserve">Takto získané klauzuly následne vložíme do SAT </w:t>
+      </w:r>
+      <w:proofErr w:type="spellStart"/>
+      <w:r>
+        <w:t>solvera</w:t>
+      </w:r>
+      <w:proofErr w:type="spellEnd"/>
+      <w:r>
+        <w:t>, ktorý nám vráti výsledok.</w:t>
+      </w:r>
+    </w:p>
+    <w:p>
+      <w:pPr>
+        <w:rPr>
+          <w:b/>
+          <w:bCs/>
+        </w:rPr>
+      </w:pPr>
+      <w:r>
+        <w:rPr>
+          <w:b/>
+          <w:bCs/>
+        </w:rPr>
+        <w:t>23</w:t>
+      </w:r>
+    </w:p>
+    <w:p>
+      <w:r>
+        <w:t>Ak by sme chceli z tabuľky spätne rekonštruovať odvodenie slova, je to možné – stačí sledovať správne kombinácie.</w:t>
+      </w:r>
+    </w:p>
+    <w:p>
+      <w:r>
+        <w:pict w14:anchorId="797F38ED">
+          <v:rect id="_x0000_i1039" style="width:0;height:1.5pt" o:hralign="center" o:bullet="t" o:hrstd="t" o:hr="t" fillcolor="#a0a0a0" stroked="f"/>
+        </w:pict>
+      </w:r>
+    </w:p>
+    <w:p>
+      <w:proofErr w:type="spellStart"/>
+      <w:r>
+        <w:rPr>
+          <w:b/>
+          <w:bCs/>
+        </w:rPr>
+        <w:t>Final</w:t>
+      </w:r>
+      <w:proofErr w:type="spellEnd"/>
+      <w:r>
+        <w:rPr>
+          <w:b/>
+          <w:bCs/>
+        </w:rPr>
+        <w:t xml:space="preserve"> </w:t>
       </w:r>
       <w:r>
         <w:rPr>
@@ -688,80 +1550,28 @@
       </w:r>
     </w:p>
     <w:p>
-      <w:pPr>
-        <w:pStyle w:val="Odsekzoznamu"/>
-        <w:numPr>
-          <w:ilvl w:val="0"/>
-          <w:numId w:val="5"/>
-        </w:numPr>
-      </w:pPr>
-      <w:r>
-        <w:t>Dokončenie návrhu vlastného algoritmu</w:t>
-      </w:r>
-    </w:p>
-    <w:p>
-      <w:pPr>
-        <w:numPr>
-          <w:ilvl w:val="0"/>
-          <w:numId w:val="4"/>
-        </w:numPr>
-      </w:pPr>
-      <w:r>
-        <w:t>Implementácia algoritmu (kód)</w:t>
-      </w:r>
-    </w:p>
-    <w:p>
-      <w:pPr>
-        <w:numPr>
-          <w:ilvl w:val="0"/>
-          <w:numId w:val="4"/>
-        </w:numPr>
-      </w:pPr>
-      <w:r>
-        <w:lastRenderedPageBreak/>
-        <w:t>Overenie na konkrétnych príkladoch</w:t>
-      </w:r>
-    </w:p>
-    <w:p>
-      <w:pPr>
-        <w:numPr>
-          <w:ilvl w:val="0"/>
-          <w:numId w:val="4"/>
-        </w:numPr>
-      </w:pPr>
-      <w:r>
-        <w:t>Testovanie a vyhodnotenie výsledkov</w:t>
-      </w:r>
-    </w:p>
-    <w:p>
-      <w:pPr>
-        <w:numPr>
-          <w:ilvl w:val="0"/>
-          <w:numId w:val="4"/>
-        </w:numPr>
-      </w:pPr>
-      <w:r>
-        <w:t>Vizualizácia algoritmu pomocou jednoduchého UI</w:t>
-      </w:r>
-    </w:p>
-    <w:p>
-      <w:pPr>
-        <w:numPr>
-          <w:ilvl w:val="0"/>
-          <w:numId w:val="4"/>
-        </w:numPr>
-      </w:pPr>
-      <w:r>
-        <w:t>Dokončenie písomnej časti práce</w:t>
-      </w:r>
-    </w:p>
-    <w:p>
       <w:r>
         <w:t>„V nasledujúcom semestri sa plánujem zamerať predovšetkým na dokončenie návrhu</w:t>
       </w:r>
       <w:r>
         <w:br/>
-        <w:t>vlastného algoritmu pre redukciu parsovacieho problému bezkontextových gramatík na SAT problém.</w:t>
+        <w:t xml:space="preserve">vlastného algoritmu pre redukciu </w:t>
+      </w:r>
+      <w:proofErr w:type="spellStart"/>
+      <w:r>
+        <w:t>parsovacieho</w:t>
+      </w:r>
+      <w:proofErr w:type="spellEnd"/>
+      <w:r>
+        <w:t xml:space="preserve"> problému </w:t>
+      </w:r>
+      <w:proofErr w:type="spellStart"/>
+      <w:r>
+        <w:t>bezkontextových</w:t>
+      </w:r>
+      <w:proofErr w:type="spellEnd"/>
+      <w:r>
+        <w:t xml:space="preserve"> gramatík na SAT problém.</w:t>
       </w:r>
     </w:p>
     <w:p>
@@ -772,7 +1582,15 @@
         <w:t xml:space="preserve"> </w:t>
       </w:r>
       <w:r>
-        <w:t>a jeho aplikácia na konkrétne príklady bezkontextových gramatík a vstupných reťazcov.</w:t>
+        <w:t xml:space="preserve">a jeho aplikácia na konkrétne príklady </w:t>
+      </w:r>
+      <w:proofErr w:type="spellStart"/>
+      <w:r>
+        <w:t>bezkontextových</w:t>
+      </w:r>
+      <w:proofErr w:type="spellEnd"/>
+      <w:r>
+        <w:t xml:space="preserve"> gramatík a vstupných reťazcov.</w:t>
       </w:r>
     </w:p>
     <w:p>
@@ -786,6 +1604,7 @@
     </w:p>
     <w:p>
       <w:r>
+        <w:lastRenderedPageBreak/>
         <w:t>Ako doplnkovú časť práce zvažujem aj vytvorenie jednoduchého používateľského rozhrania,</w:t>
       </w:r>
       <w:r>
@@ -822,6 +1641,11 @@
 
 <file path=word/numbering.xml><?xml version="1.0" encoding="utf-8"?>
 <w:numbering xmlns:wpc="http://schemas.microsoft.com/office/word/2010/wordprocessingCanvas" xmlns:cx="http://schemas.microsoft.com/office/drawing/2014/chartex" xmlns:cx1="http://schemas.microsoft.com/office/drawing/2015/9/8/chartex" xmlns:cx2="http://schemas.microsoft.com/office/drawing/2015/10/21/chartex" xmlns:cx3="http://schemas.microsoft.com/office/drawing/2016/5/9/chartex" xmlns:cx4="http://schemas.microsoft.com/office/drawing/2016/5/10/chartex" xmlns:cx5="http://schemas.microsoft.com/office/drawing/2016/5/11/chartex" xmlns:cx6="http://schemas.microsoft.com/office/drawing/2016/5/12/chartex" xmlns:cx7="http://schemas.microsoft.com/office/drawing/2016/5/13/chartex" xmlns:cx8="http://schemas.microsoft.com/office/drawing/2016/5/14/chartex" xmlns:mc="http://schemas.openxmlformats.org/markup-compatibility/2006" xmlns:aink="http://schemas.microsoft.com/office/drawing/2016/ink" xmlns:am3d="http://schemas.microsoft.com/office/drawing/2017/model3d" xmlns:o="urn:schemas-microsoft-com:office:office" xmlns:oel="http://schemas.microsoft.com/office/2019/extlst" xmlns:r="http://schemas.openxmlformats.org/officeDocument/2006/relationships" xmlns:m="http://schemas.openxmlformats.org/officeDocument/2006/math" xmlns:v="urn:schemas-microsoft-com:vml" xmlns:wp14="http://schemas.microsoft.com/office/word/2010/wordprocessingDrawing" xmlns:wp="http://schemas.openxmlformats.org/drawingml/2006/wordprocessingDrawing" xmlns:w10="urn:schemas-microsoft-com:office:word" xmlns:w="http://schemas.openxmlformats.org/wordprocessingml/2006/main" xmlns:w14="http://schemas.microsoft.com/office/word/2010/wordml" xmlns:w15="http://schemas.microsoft.com/office/word/2012/wordml" xmlns:w16cex="http://schemas.microsoft.com/office/word/2018/wordml/cex" xmlns:w16cid="http://schemas.microsoft.com/office/word/2016/wordml/cid" xmlns:w16="http://schemas.microsoft.com/office/word/2018/wordml" xmlns:w16du="http://schemas.microsoft.com/office/word/2023/wordml/word16du" xmlns:w16sdtdh="http://schemas.microsoft.com/office/word/2020/wordml/sdtdatahash" xmlns:w16sdtfl="http://schemas.microsoft.com/office/word/2024/wordml/sdtformatlock" xmlns:w16se="http://schemas.microsoft.com/office/word/2015/wordml/symex" xmlns:wpg="http://schemas.microsoft.com/office/word/2010/wordprocessingGroup" xmlns:wpi="http://schemas.microsoft.com/office/word/2010/wordprocessingInk" xmlns:wne="http://schemas.microsoft.com/office/word/2006/wordml" xmlns:wps="http://schemas.microsoft.com/office/word/2010/wordprocessingShape" mc:Ignorable="w14 w15 w16se w16cid w16 w16cex w16sdtdh w16sdtfl w16du wp14">
+  <w:numPicBullet w:numPicBulletId="0">
+    <w:pict>
+      <v:rect id="_x0000_i1025" style="width:0;height:1.5pt" o:hralign="center" o:bullet="t" o:hrstd="t" o:hr="t" fillcolor="#a0a0a0" stroked="f"/>
+    </w:pict>
+  </w:numPicBullet>
   <w:abstractNum w:abstractNumId="0" w15:restartNumberingAfterBreak="0">
     <w:nsid w:val="117616DE"/>
     <w:multiLevelType w:val="hybridMultilevel"/>

</xml_diff>